<commit_message>
Record verified multiplayer release and finalize design manuals
</commit_message>
<xml_diff>
--- a/docx/01-产品与架构设计.docx
+++ b/docx/01-产品与架构设计.docx
@@ -111,7 +111,7 @@
     </w:p>
     <w:p>
       <w:r>
-        <w:t>云端只接收动作请求，校验玩家归属、参数和比赛状态后推进权威模拟，并持久化到 D1。客户端不能提交血量、坐标、分数或其他玩家的动作。第一版以约 400 毫秒一次的 HTTP 请求交换快照，通过动画插值和有限视觉预测获得连续观感。快照频率与绘制帧率分离。</w:t>
+        <w:t>云端只接收动作请求，校验玩家归属、参数和比赛状态后推进权威模拟，并持久化到 D1。客户端不能提交血量、坐标、分数或其他玩家的动作。第一版以约 400 毫秒一次的 HTTP 请求交换快照，通过动画插值获得连续观感。快照频率与绘制帧率分离。</w:t>
       </w:r>
     </w:p>
     <w:p>
@@ -126,7 +126,7 @@
     </w:p>
     <w:p>
       <w:r>
-        <w:t>Python 初始资源从固定版本公开发行包加载，必须显示加载进度、失败与重试。后续可将同版本资源托管到自己可控的静态源。浏览器本地运行不等同于服务器代码沙箱。</w:t>
+        <w:t>Python 资源采用 Pyodide 0.27.7，构建时从锁定依赖复制到本站静态目录；加载、失败与重试状态可见，不依赖第三方 CDN。浏览器本地运行不等同于服务器代码沙箱。</w:t>
       </w:r>
     </w:p>
     <w:p>
@@ -149,7 +149,7 @@
     </w:p>
     <w:p>
       <w:r>
-        <w:t>actions 为 robot_id 到动作字典的映射。move 含 x/y；gather 和 attack 含 target_id；idle 无目标。只接受本玩家机器人；拒绝非有限数、未知动作和过大消息。memory 必须为可 JSON 序列化对象，设置大小上限。不要依赖解释器全局变量，部署后仅保留通过校验的 memory。</w:t>
+        <w:t>actions 为 robot_id 到动作字典的映射。move 含 x/y；gather 和 attack 含 target_id；idle 无目标。只接受本玩家机器人；拒绝非有限数、未知动作和过大消息。memory 必须为可 JSON 序列化对象，设置大小上限。不要依赖解释器全局变量，第一版部署新代码时重置 memory，同一运行版本内保留通过校验的 memory。</w:t>
       </w:r>
     </w:p>
     <w:p>
@@ -164,7 +164,7 @@
     </w:p>
     <w:p>
       <w:r>
-        <w:t>模拟采用固定 50 毫秒步长。每个请求最多推进有界数量步，空闲超时房间直接结束或标记过期，避免单请求无限追赶。移动、资源争抢、攻击和计分均由同一纯函数处理，训练复用该函数。读取接口过滤席位凭证和内部字段。</w:t>
+        <w:t>模拟采用固定 50 毫秒步长。每个请求最多推进有界数量步，到达三分钟墙钟截止后结束，创建一小时后房间过期，避免单请求无限追赶。移动、资源争抢、攻击和计分均由同一纯函数处理，训练复用该函数。读取接口过滤席位凭证和内部字段。</w:t>
       </w:r>
     </w:p>
     <w:p>
@@ -235,7 +235,7 @@
     </w:p>
     <w:p>
       <w:r>
-        <w:t>新站默认私有，按平台权限控制访问。房间码不是 Sites 访问授权；邀请的朋友仍须具有站点访问权限。开放公共访问或增加指定访问者时需要按用户指定范围操作，不能因为有联机功能就擅自公开站点。</w:t>
+        <w:t>用户已于 2026-09-13 明确授权公开链接，最终访问范围设为 public，任何拿到网址的人可进入。房间仍使用独立席位令牌鉴权。后续变更访问范围应遵循用户指定范围。</w:t>
       </w:r>
     </w:p>
     <w:p>
@@ -975,15 +975,12 @@
     <w:qFormat/>
     <w:rsid w:val="00FC693F"/>
     <w:pPr>
-      <w:pBdr>
-        <w:bottom w:val="single" w:sz="8" w:space="4" w:color="4F81BD" w:themeColor="accent1"/>
-      </w:pBdr>
       <w:spacing w:after="300" w:line="240" w:lineRule="auto"/>
       <w:contextualSpacing/>
     </w:pPr>
     <w:rPr>
       <w:rFonts w:asciiTheme="majorHAnsi" w:eastAsiaTheme="majorEastAsia" w:hAnsiTheme="majorHAnsi" w:cstheme="majorBidi" w:ascii="Microsoft YaHei" w:hAnsi="Microsoft YaHei" w:eastAsia="Microsoft YaHei"/>
-      <w:color w:val="143B4A"/>
+      <w:color w:val="111111"/>
       <w:spacing w:val="5"/>
       <w:kern w:val="28"/>
       <w:sz w:val="50"/>
@@ -1462,9 +1459,6 @@
     <w:qFormat/>
     <w:rsid w:val="00FC693F"/>
     <w:pPr>
-      <w:pBdr>
-        <w:bottom w:val="single" w:sz="4" w:space="4" w:color="4F81BD" w:themeColor="accent1"/>
-      </w:pBdr>
       <w:spacing w:before="200" w:after="280"/>
       <w:ind w:left="936" w:right="936"/>
     </w:pPr>

</xml_diff>